<commit_message>
Título da disciplina nos slides e apostila de referência na página de apresentação
Capas e slides de dados passam a exibir "Estado, Governo e Mercado";
slides de conteúdo ganham a identificação da disciplina e da unidade.
Página de apresentação: novo cartão com o link oficial do livro-texto
(COELHO, 2014) no Portal EduCAPES. Plano de ensino com o link da apostila.

Co-Authored-By: Claude Opus 5.5 <noreply@anthropic.com>
Claude-Session: https://claude.ai/code/session_01PyQDDPKwUxu1Vg7o8uyr7W
</commit_message>
<xml_diff>
--- a/disciplina-01-estado-governo-mercado/materiais/Plano_de_Ensino_Estado_Governo_e_Mercado.docx
+++ b/disciplina-01-estado-governo-mercado/materiais/Plano_de_Ensino_Estado_Governo_e_Mercado.docx
@@ -1884,7 +1884,7 @@
                 <w:rFonts w:ascii="Arial" w:hAnsi="Arial" w:cs="Arial"/>
                 <w:color w:val="auto"/>
               </w:rPr>
-              <w:t xml:space="preserve">COELHO, Ricardo Corrêa. Estado, governo e mercado. 3. ed. Florianópolis: UFSC; Brasília: CAPES/UAB, 2014. Unidade referente aos conceitos básicos.</w:t>
+              <w:t xml:space="preserve">COELHO, Ricardo Corrêa. Estado, governo e mercado. 3. ed. Florianópolis: UFSC; Brasília: CAPES/UAB, 2014. Unidade referente aos conceitos básicos. Disponível no Portal EduCAPES: https://educapes.capes.gov.br/bitstream/capes/145389/1/PNAP%20-%20Modulo%20Basico%20-%20GP%20-%20Estado%20Governo%20e%20Mercado.pdf</w:t>
             </w:r>
           </w:p>
           <w:p>
@@ -5664,7 +5664,7 @@
           <w:rFonts w:ascii="Arial" w:hAnsi="Arial" w:cs="Arial"/>
           <w:color w:val="auto"/>
         </w:rPr>
-        <w:t xml:space="preserve">COELHO, Ricardo Corrêa. Estado, governo e mercado. 3. ed. rev. atual. Florianópolis: Departamento de Ciências da Administração/UFSC; Brasília: CAPES: UAB, 2014.</w:t>
+        <w:t xml:space="preserve">COELHO, Ricardo Corrêa. Estado, governo e mercado. 3. ed. rev. atual. Florianópolis: Departamento de Ciências da Administração/UFSC; Brasília: CAPES: UAB, 2014. Disponível em: https://educapes.capes.gov.br/bitstream/capes/145389/1/PNAP%20-%20Modulo%20Basico%20-%20GP%20-%20Estado%20Governo%20e%20Mercado.pdf</w:t>
       </w:r>
     </w:p>
     <w:p>

</xml_diff>

<commit_message>
Slides das unidades ampliados com conceitos, exemplos e quiz
Unidades 1 a 4 passam de 8–11 para 27–33 slides: novos conceitos
(elementos do Estado, dominação em Weber, contratualistas, Montesquieu,
modo de produção e mais-valia, Engels, Keynes e o multiplicador, regimes
de bem-estar, modelos de administração pública), exemplos aplicados à
gestão pública e quiz de 5 perguntas com resposta comentada ao final
de cada unidade. Plano de ensino atualizado.

Co-Authored-By: Claude Opus 5.5 <noreply@anthropic.com>
Claude-Session: https://claude.ai/code/session_01PyQDDPKwUxu1Vg7o8uyr7W
</commit_message>
<xml_diff>
--- a/disciplina-01-estado-governo-mercado/materiais/Plano_de_Ensino_Estado_Governo_e_Mercado.docx
+++ b/disciplina-01-estado-governo-mercado/materiais/Plano_de_Ensino_Estado_Governo_e_Mercado.docx
@@ -634,14 +634,14 @@
                 <w:b/>
                 <w:color w:val="auto"/>
               </w:rPr>
-              <w:t xml:space="preserve">Slides da disciplina </w:t>
-            </w:r>
-            <w:r>
-              <w:rPr>
-                <w:rFonts w:ascii="Arial" w:hAnsi="Arial" w:cs="Arial"/>
-                <w:color w:val="auto"/>
-              </w:rPr>
-              <w:t xml:space="preserve">(28 slides), para revisão e apoio às videoaulas: https://cleitonfranco74.github.io/gestao_publica/disciplina-01-estado-governo-mercado/slides.html;</w:t>
+              <w:t xml:space="preserve">Slides das videoaulas </w:t>
+            </w:r>
+            <w:r>
+              <w:rPr>
+                <w:rFonts w:ascii="Arial" w:hAnsi="Arial" w:cs="Arial"/>
+                <w:color w:val="auto"/>
+              </w:rPr>
+              <w:t xml:space="preserve">no padrão DEAD/UAB, um conjunto por unidade, com conceitos, exemplos aplicados à gestão pública e quiz de revisão de 5 perguntas ao final: https://cleitonfranco74.github.io/gestao_publica/disciplina-01-estado-governo-mercado/apresentacao.html;</w:t>
             </w:r>
           </w:p>
           <w:p>

</xml_diff>

<commit_message>
Um único encontro síncrono (28/10/2026, 19h) no lugar de cinco webaulas
A disciplina prevê apenas um encontro síncrono. Slides (apresentação e
unidades), plano de ensino e página de conteúdos atualizados: 28,5 h
assíncronas e 1,5 h síncrona, com presença obrigatória.

Co-Authored-By: Claude Opus 5.5 <noreply@anthropic.com>
Claude-Session: https://claude.ai/code/session_01PyQDDPKwUxu1Vg7o8uyr7W
</commit_message>
<xml_diff>
--- a/disciplina-01-estado-governo-mercado/materiais/Plano_de_Ensino_Estado_Governo_e_Mercado.docx
+++ b/disciplina-01-estado-governo-mercado/materiais/Plano_de_Ensino_Estado_Governo_e_Mercado.docx
@@ -727,14 +727,14 @@
                 <w:b/>
                 <w:color w:val="auto"/>
               </w:rPr>
-              <w:t xml:space="preserve">Webaulas semanais </w:t>
-            </w:r>
-            <w:r>
-              <w:rPr>
-                <w:rFonts w:ascii="Arial" w:hAnsi="Arial" w:cs="Arial"/>
-                <w:color w:val="auto"/>
-              </w:rPr>
-              <w:t xml:space="preserve">com professor e mediador pedagógico, para aprofundamento dos conteúdos e esclarecimento de dúvidas;</w:t>
+              <w:t xml:space="preserve">Um encontro síncrono </w:t>
+            </w:r>
+            <w:r>
+              <w:rPr>
+                <w:rFonts w:ascii="Arial" w:hAnsi="Arial" w:cs="Arial"/>
+                <w:color w:val="auto"/>
+              </w:rPr>
+              <w:t xml:space="preserve">(webaula de 1h30, em 28/10) com professor e mediador pedagógico, para revisão dos conteúdos e esclarecimento de dúvidas, com gravação disponível no SIGAA;</w:t>
             </w:r>
           </w:p>
           <w:p>
@@ -978,7 +978,7 @@
                 <w:rFonts w:ascii="Arial" w:hAnsi="Arial" w:cs="Arial"/>
                 <w:color w:val="auto"/>
               </w:rPr>
-              <w:t xml:space="preserve">fóruns temáticos e webaulas, com retorno do mediador pedagógico, e exercícios de fixação com comentário em cada questão, que indicam ao aluno o que precisa revisar;</w:t>
+              <w:t xml:space="preserve">fóruns temáticos e o encontro síncrono, com retorno do mediador pedagógico, e exercícios de fixação com comentário em cada questão, que indicam ao aluno o que precisa revisar;</w:t>
             </w:r>
           </w:p>
           <w:p>
@@ -2232,7 +2232,7 @@
                 <w:rFonts w:ascii="Arial" w:hAnsi="Arial" w:cs="Arial"/>
                 <w:color w:val="auto"/>
               </w:rPr>
-              <w:t xml:space="preserve">(1) assistir à videoaula da unidade; (2) ler a leitura obrigatória; (3) estudar as Unidades 3 e 4 da página de conteúdos e os slides 11 a 15; (4) fazer os Exercícios de fixação 1 e participar da webaula; (5) responder à Avaliação A1 no SIGAA.</w:t>
+              <w:t xml:space="preserve">(1) assistir à videoaula da unidade; (2) ler a leitura obrigatória; (3) estudar as Unidades 3 e 4 da página de conteúdos e os slides 11 a 15; (4) fazer os Exercícios de fixação 1; (5) responder à Avaliação A1 no SIGAA.</w:t>
             </w:r>
           </w:p>
         </w:tc>
@@ -2510,29 +2510,6 @@
               <w:t xml:space="preserve">Exercícios de fixação 1 (não avaliativos): https://cleitonfranco74.github.io/gestao_publica/disciplina-01-estado-governo-mercado/exercicios-1.html</w:t>
             </w:r>
           </w:p>
-          <w:p>
-            <w:pPr>
-              <w:widowControl w:val="0"/>
-              <w:numPr>
-                <w:ilvl w:val="0"/>
-                <w:numId w:val="2"/>
-              </w:numPr>
-              <w:spacing w:line="360" w:lineRule="auto"/>
-              <w:ind w:left="360" w:hanging="285"/>
-              <w:jc w:val="both"/>
-              <w:rPr>
-                <w:rFonts w:ascii="Arial" w:hAnsi="Arial" w:cs="Arial"/>
-                <w:color w:val="auto"/>
-              </w:rPr>
-            </w:pPr>
-            <w:r>
-              <w:rPr>
-                <w:rFonts w:ascii="Arial" w:hAnsi="Arial" w:cs="Arial"/>
-                <w:color w:val="auto"/>
-              </w:rPr>
-              <w:t xml:space="preserve">2ª webaula: 21/10, 19h.</w:t>
-            </w:r>
-          </w:p>
         </w:tc>
       </w:tr>
     </w:tbl>
@@ -2655,7 +2632,7 @@
                 <w:rFonts w:ascii="Arial" w:hAnsi="Arial" w:cs="Arial"/>
                 <w:color w:val="auto"/>
               </w:rPr>
-              <w:t xml:space="preserve">(1) assistir à videoaula da unidade; (2) ler a leitura obrigatória; (3) estudar as Unidades 5 e 6 da página de conteúdos e os slides 16 a 20; (4) participar do Fórum temático 2 e da webaula.</w:t>
+              <w:t xml:space="preserve">(1) assistir à videoaula da unidade; (2) ler a leitura obrigatória; (3) estudar as Unidades 5 e 6 da página de conteúdos e os slides 16 a 20; (4) participar do Fórum temático 2 e do encontro síncrono (28/10, 19h).</w:t>
             </w:r>
           </w:p>
         </w:tc>
@@ -2930,7 +2907,7 @@
                 <w:rFonts w:ascii="Arial" w:hAnsi="Arial" w:cs="Arial"/>
                 <w:color w:val="auto"/>
               </w:rPr>
-              <w:t xml:space="preserve">Fórum temático 2 (até 01/11) e 3ª webaula (28/10, 19h).</w:t>
+              <w:t xml:space="preserve">Fórum temático 2 (até 01/11) e encontro síncrono (28/10, 19h).</w:t>
             </w:r>
           </w:p>
         </w:tc>
@@ -3054,7 +3031,7 @@
                 <w:rFonts w:ascii="Arial" w:hAnsi="Arial" w:cs="Arial"/>
                 <w:color w:val="auto"/>
               </w:rPr>
-              <w:t xml:space="preserve">(1) assistir à videoaula da unidade; (2) ler a leitura obrigatória; (3) estudar as Unidades 7 e 8 da página de conteúdos e os slides 21 a 28; (4) fazer os Exercícios de fixação 2 e participar da webaula de revisão; (5) responder às Avaliações A2 e A3 no SIGAA.</w:t>
+              <w:t xml:space="preserve">(1) assistir à videoaula da unidade; (2) ler a leitura obrigatória; (3) estudar as Unidades 7 e 8 da página de conteúdos e os slides 21 a 28; (4) fazer os Exercícios de fixação 2 e rever a gravação do encontro síncrono; (5) responder às Avaliações A2 e A3 no SIGAA.</w:t>
             </w:r>
           </w:p>
         </w:tc>
@@ -3421,7 +3398,7 @@
                 <w:rFonts w:ascii="Arial" w:hAnsi="Arial" w:cs="Arial"/>
                 <w:color w:val="auto"/>
               </w:rPr>
-              <w:t xml:space="preserve">Webaula de revisão para as Avaliações A2 e A3.</w:t>
+              <w:t xml:space="preserve">Gravação do encontro síncrono (28/10), com orientações para as Avaliações A2 e A3.</w:t>
             </w:r>
           </w:p>
         </w:tc>
@@ -3787,20 +3764,6 @@
             </w:pPr>
             <w:r>
               <w:rPr/>
-              <w:t xml:space="preserve">2ª webaula: 21/10, 19h.</w:t>
-            </w:r>
-          </w:p>
-          <w:p>
-            <w:pPr>
-              <w:spacing w:line="360" w:lineRule="auto"/>
-              <w:jc w:val="center"/>
-              <w:rPr>
-                <w:rFonts w:ascii="Arial" w:hAnsi="Arial" w:cs="Arial"/>
-                <w:color w:val="auto"/>
-              </w:rPr>
-            </w:pPr>
-            <w:r>
-              <w:rPr/>
               <w:t xml:space="preserve">Avaliação A1 (a distância): questionário no SIGAA, 10 questões de múltipla escolha sobre as Unidades 1 e 2.</w:t>
             </w:r>
           </w:p>
@@ -3903,7 +3866,7 @@
             </w:pPr>
             <w:r>
               <w:rPr/>
-              <w:t xml:space="preserve">3ª webaula: 28/10, 19h.</w:t>
+              <w:t xml:space="preserve">Encontro síncrono: 28/10, 19h às 20h30.</w:t>
             </w:r>
           </w:p>
         </w:tc>
@@ -4005,7 +3968,7 @@
             </w:pPr>
             <w:r>
               <w:rPr/>
-              <w:t xml:space="preserve">4ª webaula (04/11) e 5ª webaula de revisão (11/11), 19h.</w:t>
+              <w:t xml:space="preserve">Semana de revisão (09/11 a 15/11), com a gravação do encontro síncrono.</w:t>
             </w:r>
           </w:p>
           <w:p>
@@ -4356,7 +4319,7 @@
                 <w:b/>
                 <w:color w:val="auto"/>
               </w:rPr>
-              <w:t xml:space="preserve">Chats ou webaulas ou aula de revisão</w:t>
+              <w:t xml:space="preserve">Encontro síncrono</w:t>
             </w:r>
           </w:p>
           <w:p>
@@ -4379,7 +4342,7 @@
                 <w:rFonts w:ascii="Arial" w:hAnsi="Arial" w:cs="Arial"/>
                 <w:color w:val="auto"/>
               </w:rPr>
-              <w:t xml:space="preserve">Uma webaula por semana com professor e mediador pedagógico (cronograma no item 7), gravada e disponibilizada no SIGAA;</w:t>
+              <w:t xml:space="preserve">Um encontro síncrono de 1h30 com professor e mediador pedagógico, em 28/10, às 19h (item 7), gravado e disponibilizado no SIGAA;</w:t>
             </w:r>
           </w:p>
           <w:p>
@@ -4669,7 +4632,7 @@
                 <w:rFonts w:ascii="Arial" w:hAnsi="Arial" w:cs="Arial"/>
                 <w:color w:val="auto"/>
               </w:rPr>
-              <w:t xml:space="preserve">A disciplina terá três avaliações, todas a distância e realizadas no SIGAA, conforme o limite de três avaliações por disciplina (Resolução 54/2011): A1 e A2, em formato de questionário automático, e A3, com questionário automático e estudo de caso discursivo enviado em arquivo. Os fóruns, os exercícios de fixação e as webaulas têm caráter formativo e preparam o aluno para as avaliações. Estão previstas também a avaliação de 2ª chamada e a Prova Final, no mesmo formato da A3, com questões diferentes. As questões objetivas são disponibilizadas em arquivos GIFT para importação no banco de questões do SIGAA, e os gabaritos e espelhos de correção são encaminhados em documento separado, de uso restrito do professor e dos mediadores pedagógicos.</w:t>
+              <w:t xml:space="preserve">A disciplina terá três avaliações, todas a distância e realizadas no SIGAA, conforme o limite de três avaliações por disciplina (Resolução 54/2011): A1 e A2, em formato de questionário automático, e A3, com questionário automático e estudo de caso discursivo enviado em arquivo. Os fóruns, os exercícios de fixação e o encontro síncrono têm caráter formativo e preparam o aluno para as avaliações. Estão previstas também a avaliação de 2ª chamada e a Prova Final, no mesmo formato da A3, com questões diferentes. As questões objetivas são disponibilizadas em arquivos GIFT para importação no banco de questões do SIGAA, e os gabaritos e espelhos de correção são encaminhados em documento separado, de uso restrito do professor e dos mediadores pedagógicos.</w:t>
             </w:r>
           </w:p>
         </w:tc>
@@ -5054,7 +5017,7 @@
           <w:rFonts w:ascii="Arial" w:hAnsi="Arial" w:cs="Arial"/>
           <w:color w:val="auto"/>
         </w:rPr>
-        <w:t xml:space="preserve">Cinco webaulas síncronas (Google Meet), de 1h30 cada, às quartas-feiras, das 19h às 20h30 (horário a confirmar com a Coordenação). Os links são divulgados no SIGAA.</w:t>
+        <w:t xml:space="preserve">A disciplina prevê um único encontro síncrono (Google Meet), de 1h30, gravado e disponibilizado no SIGAA. O link é divulgado no SIGAA; data e horário a confirmar com a Coordenação.</w:t>
       </w:r>
     </w:p>
     <w:tbl>
@@ -5183,7 +5146,7 @@
             </w:pPr>
             <w:r>
               <w:rPr/>
-              <w:t xml:space="preserve">14/10/2026 (qua)</w:t>
+              <w:t xml:space="preserve">28/10/2026 (qua)</w:t>
             </w:r>
           </w:p>
           <w:p>
@@ -5221,7 +5184,7 @@
             </w:pPr>
             <w:r>
               <w:rPr/>
-              <w:t xml:space="preserve">1ª webaula: aula inaugural</w:t>
+              <w:t xml:space="preserve">Encontro síncrono (webaula)</w:t>
             </w:r>
           </w:p>
         </w:tc>
@@ -5246,355 +5209,7 @@
             </w:pPr>
             <w:r>
               <w:rPr/>
-              <w:t xml:space="preserve">Apresentação da disciplina, do plano de ensino e das avaliações; Unidade 1: conceitos de economia, Estado, governo e mercado; falhas de mercado.</w:t>
-            </w:r>
-          </w:p>
-        </w:tc>
-      </w:tr>
-      <w:tr>
-        <w:tc>
-          <w:tcPr>
-            <w:tcW w:w="1259" w:type="dxa"/>
-            <w:tcBorders>
-              <w:left w:val="single" w:sz="4" w:space="0" w:color="000000"/>
-              <w:bottom w:val="single" w:sz="4" w:space="0" w:color="000000"/>
-            </w:tcBorders>
-          </w:tcPr>
-          <w:p>
-            <w:pPr>
-              <w:spacing w:line="360" w:lineRule="auto"/>
-              <w:rPr>
-                <w:rFonts w:ascii="Arial" w:hAnsi="Arial" w:cs="Arial"/>
-                <w:color w:val="auto"/>
-              </w:rPr>
-            </w:pPr>
-            <w:r>
-              <w:rPr/>
-              <w:t xml:space="preserve">21/10/2026 (qua)</w:t>
-            </w:r>
-          </w:p>
-          <w:p>
-            <w:pPr>
-              <w:spacing w:line="360" w:lineRule="auto"/>
-              <w:rPr>
-                <w:rFonts w:ascii="Arial" w:hAnsi="Arial" w:cs="Arial"/>
-                <w:color w:val="auto"/>
-              </w:rPr>
-            </w:pPr>
-            <w:r>
-              <w:rPr/>
-              <w:t xml:space="preserve">19h às 20h30</w:t>
-            </w:r>
-          </w:p>
-        </w:tc>
-        <w:tc>
-          <w:tcPr>
-            <w:tcW w:w="3820" w:type="dxa"/>
-            <w:tcBorders>
-              <w:top w:val="single" w:sz="4" w:space="0" w:color="000000"/>
-              <w:left w:val="single" w:sz="4" w:space="0" w:color="000000"/>
-              <w:bottom w:val="single" w:sz="4" w:space="0" w:color="000000"/>
-              <w:right w:val="single" w:sz="4" w:space="0" w:color="auto"/>
-            </w:tcBorders>
-          </w:tcPr>
-          <w:p>
-            <w:pPr>
-              <w:spacing w:line="360" w:lineRule="auto"/>
-              <w:jc w:val="center"/>
-              <w:rPr>
-                <w:rFonts w:ascii="Arial" w:hAnsi="Arial" w:cs="Arial"/>
-                <w:color w:val="auto"/>
-              </w:rPr>
-            </w:pPr>
-            <w:r>
-              <w:rPr/>
-              <w:t xml:space="preserve">2ª webaula</w:t>
-            </w:r>
-          </w:p>
-        </w:tc>
-        <w:tc>
-          <w:tcPr>
-            <w:tcW w:w="4669" w:type="dxa"/>
-            <w:tcBorders>
-              <w:top w:val="single" w:sz="4" w:space="0" w:color="000000"/>
-              <w:left w:val="single" w:sz="4" w:space="0" w:color="000000"/>
-              <w:bottom w:val="single" w:sz="4" w:space="0" w:color="000000"/>
-              <w:right w:val="single" w:sz="4" w:space="0" w:color="auto"/>
-            </w:tcBorders>
-          </w:tcPr>
-          <w:p>
-            <w:pPr>
-              <w:spacing w:line="360" w:lineRule="auto"/>
-              <w:jc w:val="center"/>
-              <w:rPr>
-                <w:rFonts w:ascii="Arial" w:hAnsi="Arial" w:cs="Arial"/>
-                <w:color w:val="auto"/>
-              </w:rPr>
-            </w:pPr>
-            <w:r>
-              <w:rPr/>
-              <w:t xml:space="preserve">Unidade 2: dinâmica pendular; matriz liberal (Locke e Adam Smith); orientações para a A1.</w:t>
-            </w:r>
-          </w:p>
-        </w:tc>
-      </w:tr>
-      <w:tr>
-        <w:tc>
-          <w:tcPr>
-            <w:tcW w:w="1259" w:type="dxa"/>
-            <w:tcBorders>
-              <w:left w:val="single" w:sz="4" w:space="0" w:color="000000"/>
-              <w:bottom w:val="single" w:sz="4" w:space="0" w:color="000000"/>
-            </w:tcBorders>
-          </w:tcPr>
-          <w:p>
-            <w:pPr>
-              <w:spacing w:line="360" w:lineRule="auto"/>
-              <w:rPr>
-                <w:rFonts w:ascii="Arial" w:hAnsi="Arial" w:cs="Arial"/>
-                <w:color w:val="auto"/>
-              </w:rPr>
-            </w:pPr>
-            <w:r>
-              <w:rPr/>
-              <w:t xml:space="preserve">28/10/2026 (qua)</w:t>
-            </w:r>
-          </w:p>
-          <w:p>
-            <w:pPr>
-              <w:spacing w:line="360" w:lineRule="auto"/>
-              <w:rPr>
-                <w:rFonts w:ascii="Arial" w:hAnsi="Arial" w:cs="Arial"/>
-                <w:color w:val="auto"/>
-              </w:rPr>
-            </w:pPr>
-            <w:r>
-              <w:rPr/>
-              <w:t xml:space="preserve">19h às 20h30</w:t>
-            </w:r>
-          </w:p>
-        </w:tc>
-        <w:tc>
-          <w:tcPr>
-            <w:tcW w:w="3820" w:type="dxa"/>
-            <w:tcBorders>
-              <w:top w:val="single" w:sz="4" w:space="0" w:color="000000"/>
-              <w:left w:val="single" w:sz="4" w:space="0" w:color="000000"/>
-              <w:bottom w:val="single" w:sz="4" w:space="0" w:color="000000"/>
-              <w:right w:val="single" w:sz="4" w:space="0" w:color="auto"/>
-            </w:tcBorders>
-          </w:tcPr>
-          <w:p>
-            <w:pPr>
-              <w:spacing w:line="360" w:lineRule="auto"/>
-              <w:jc w:val="center"/>
-              <w:rPr>
-                <w:rFonts w:ascii="Arial" w:hAnsi="Arial" w:cs="Arial"/>
-                <w:color w:val="auto"/>
-              </w:rPr>
-            </w:pPr>
-            <w:r>
-              <w:rPr/>
-              <w:t xml:space="preserve">3ª webaula</w:t>
-            </w:r>
-          </w:p>
-        </w:tc>
-        <w:tc>
-          <w:tcPr>
-            <w:tcW w:w="4669" w:type="dxa"/>
-            <w:tcBorders>
-              <w:top w:val="single" w:sz="4" w:space="0" w:color="000000"/>
-              <w:left w:val="single" w:sz="4" w:space="0" w:color="000000"/>
-              <w:bottom w:val="single" w:sz="4" w:space="0" w:color="000000"/>
-              <w:right w:val="single" w:sz="4" w:space="0" w:color="auto"/>
-            </w:tcBorders>
-          </w:tcPr>
-          <w:p>
-            <w:pPr>
-              <w:spacing w:line="360" w:lineRule="auto"/>
-              <w:jc w:val="center"/>
-              <w:rPr>
-                <w:rFonts w:ascii="Arial" w:hAnsi="Arial" w:cs="Arial"/>
-                <w:color w:val="auto"/>
-              </w:rPr>
-            </w:pPr>
-            <w:r>
-              <w:rPr/>
-              <w:t xml:space="preserve">Unidade 3: matriz marxista; comparação liberal × marxista; mudanças do final do século XIX.</w:t>
-            </w:r>
-          </w:p>
-        </w:tc>
-      </w:tr>
-      <w:tr>
-        <w:tc>
-          <w:tcPr>
-            <w:tcW w:w="1259" w:type="dxa"/>
-            <w:tcBorders>
-              <w:left w:val="single" w:sz="4" w:space="0" w:color="000000"/>
-              <w:bottom w:val="single" w:sz="4" w:space="0" w:color="000000"/>
-            </w:tcBorders>
-          </w:tcPr>
-          <w:p>
-            <w:pPr>
-              <w:spacing w:line="360" w:lineRule="auto"/>
-              <w:rPr>
-                <w:rFonts w:ascii="Arial" w:hAnsi="Arial" w:cs="Arial"/>
-                <w:color w:val="auto"/>
-              </w:rPr>
-            </w:pPr>
-            <w:r>
-              <w:rPr/>
-              <w:t xml:space="preserve">04/11/2026 (qua)</w:t>
-            </w:r>
-          </w:p>
-          <w:p>
-            <w:pPr>
-              <w:spacing w:line="360" w:lineRule="auto"/>
-              <w:rPr>
-                <w:rFonts w:ascii="Arial" w:hAnsi="Arial" w:cs="Arial"/>
-                <w:color w:val="auto"/>
-              </w:rPr>
-            </w:pPr>
-            <w:r>
-              <w:rPr/>
-              <w:t xml:space="preserve">19h às 20h30</w:t>
-            </w:r>
-          </w:p>
-        </w:tc>
-        <w:tc>
-          <w:tcPr>
-            <w:tcW w:w="3820" w:type="dxa"/>
-            <w:tcBorders>
-              <w:top w:val="single" w:sz="4" w:space="0" w:color="000000"/>
-              <w:left w:val="single" w:sz="4" w:space="0" w:color="000000"/>
-              <w:bottom w:val="single" w:sz="4" w:space="0" w:color="000000"/>
-              <w:right w:val="single" w:sz="4" w:space="0" w:color="auto"/>
-            </w:tcBorders>
-          </w:tcPr>
-          <w:p>
-            <w:pPr>
-              <w:spacing w:line="360" w:lineRule="auto"/>
-              <w:jc w:val="center"/>
-              <w:rPr>
-                <w:rFonts w:ascii="Arial" w:hAnsi="Arial" w:cs="Arial"/>
-                <w:color w:val="auto"/>
-              </w:rPr>
-            </w:pPr>
-            <w:r>
-              <w:rPr/>
-              <w:t xml:space="preserve">4ª webaula</w:t>
-            </w:r>
-          </w:p>
-        </w:tc>
-        <w:tc>
-          <w:tcPr>
-            <w:tcW w:w="4669" w:type="dxa"/>
-            <w:tcBorders>
-              <w:top w:val="single" w:sz="4" w:space="0" w:color="000000"/>
-              <w:left w:val="single" w:sz="4" w:space="0" w:color="000000"/>
-              <w:bottom w:val="single" w:sz="4" w:space="0" w:color="000000"/>
-              <w:right w:val="single" w:sz="4" w:space="0" w:color="auto"/>
-            </w:tcBorders>
-          </w:tcPr>
-          <w:p>
-            <w:pPr>
-              <w:spacing w:line="360" w:lineRule="auto"/>
-              <w:jc w:val="center"/>
-              <w:rPr>
-                <w:rFonts w:ascii="Arial" w:hAnsi="Arial" w:cs="Arial"/>
-                <w:color w:val="auto"/>
-              </w:rPr>
-            </w:pPr>
-            <w:r>
-              <w:rPr/>
-              <w:t xml:space="preserve">Unidade 4: modelos de Estado e Estado brasileiro; orientações para a A2.</w:t>
-            </w:r>
-          </w:p>
-        </w:tc>
-      </w:tr>
-      <w:tr>
-        <w:tc>
-          <w:tcPr>
-            <w:tcW w:w="1259" w:type="dxa"/>
-            <w:tcBorders>
-              <w:left w:val="single" w:sz="4" w:space="0" w:color="000000"/>
-              <w:bottom w:val="single" w:sz="4" w:space="0" w:color="000000"/>
-            </w:tcBorders>
-          </w:tcPr>
-          <w:p>
-            <w:pPr>
-              <w:spacing w:line="360" w:lineRule="auto"/>
-              <w:rPr>
-                <w:rFonts w:ascii="Arial" w:hAnsi="Arial" w:cs="Arial"/>
-                <w:color w:val="auto"/>
-              </w:rPr>
-            </w:pPr>
-            <w:r>
-              <w:rPr/>
-              <w:t xml:space="preserve">11/11/2026 (qua)</w:t>
-            </w:r>
-          </w:p>
-          <w:p>
-            <w:pPr>
-              <w:spacing w:line="360" w:lineRule="auto"/>
-              <w:rPr>
-                <w:rFonts w:ascii="Arial" w:hAnsi="Arial" w:cs="Arial"/>
-                <w:color w:val="auto"/>
-              </w:rPr>
-            </w:pPr>
-            <w:r>
-              <w:rPr/>
-              <w:t xml:space="preserve">19h às 20h30</w:t>
-            </w:r>
-          </w:p>
-        </w:tc>
-        <w:tc>
-          <w:tcPr>
-            <w:tcW w:w="3820" w:type="dxa"/>
-            <w:tcBorders>
-              <w:top w:val="single" w:sz="4" w:space="0" w:color="000000"/>
-              <w:left w:val="single" w:sz="4" w:space="0" w:color="000000"/>
-              <w:bottom w:val="single" w:sz="4" w:space="0" w:color="000000"/>
-              <w:right w:val="single" w:sz="4" w:space="0" w:color="auto"/>
-            </w:tcBorders>
-          </w:tcPr>
-          <w:p>
-            <w:pPr>
-              <w:spacing w:line="360" w:lineRule="auto"/>
-              <w:jc w:val="center"/>
-              <w:rPr>
-                <w:rFonts w:ascii="Arial" w:hAnsi="Arial" w:cs="Arial"/>
-                <w:color w:val="auto"/>
-              </w:rPr>
-            </w:pPr>
-            <w:r>
-              <w:rPr/>
-              <w:t xml:space="preserve">5ª webaula: revisão</w:t>
-            </w:r>
-          </w:p>
-        </w:tc>
-        <w:tc>
-          <w:tcPr>
-            <w:tcW w:w="4669" w:type="dxa"/>
-            <w:tcBorders>
-              <w:top w:val="single" w:sz="4" w:space="0" w:color="000000"/>
-              <w:left w:val="single" w:sz="4" w:space="0" w:color="000000"/>
-              <w:bottom w:val="single" w:sz="4" w:space="0" w:color="000000"/>
-              <w:right w:val="single" w:sz="4" w:space="0" w:color="auto"/>
-            </w:tcBorders>
-          </w:tcPr>
-          <w:p>
-            <w:pPr>
-              <w:spacing w:line="360" w:lineRule="auto"/>
-              <w:jc w:val="center"/>
-              <w:rPr>
-                <w:rFonts w:ascii="Arial" w:hAnsi="Arial" w:cs="Arial"/>
-                <w:color w:val="auto"/>
-              </w:rPr>
-            </w:pPr>
-            <w:r>
-              <w:rPr/>
-              <w:t xml:space="preserve">Revisão geral da disciplina e orientações para a A3 (a distância), com prazo em 15/11.</w:t>
+              <w:t xml:space="preserve">Revisão dos conceitos centrais das Unidades 1 a 3 (Estado, governo e mercado; falhas de mercado; matrizes liberal e marxista), esclarecimento de dúvidas e orientações para as Avaliações A2 e A3.</w:t>
             </w:r>
           </w:p>
         </w:tc>

</xml_diff>

<commit_message>
EGM: encontro síncrono único em 26/10 (segunda-feira), 19h às 20h30
Co-Authored-By: Claude Opus 5.5 <noreply@anthropic.com>
Claude-Session: https://claude.ai/code/session_01PyQDDPKwUxu1Vg7o8uyr7W
</commit_message>
<xml_diff>
--- a/disciplina-01-estado-governo-mercado/materiais/Plano_de_Ensino_Estado_Governo_e_Mercado.docx
+++ b/disciplina-01-estado-governo-mercado/materiais/Plano_de_Ensino_Estado_Governo_e_Mercado.docx
@@ -734,7 +734,7 @@
                 <w:rFonts w:ascii="Arial" w:hAnsi="Arial" w:cs="Arial"/>
                 <w:color w:val="auto"/>
               </w:rPr>
-              <w:t xml:space="preserve">(webaula de 1h30, em 28/10) com professor e mediador pedagógico, para revisão dos conteúdos e esclarecimento de dúvidas, com gravação disponível no SIGAA;</w:t>
+              <w:t xml:space="preserve">(webaula única de 1h30, em 26/10, segunda-feira) com professor e mediador pedagógico, para revisão dos conteúdos e esclarecimento de dúvidas, com gravação disponível no SIGAA;</w:t>
             </w:r>
           </w:p>
           <w:p>
@@ -1804,7 +1804,7 @@
                 <w:rFonts w:ascii="Arial" w:hAnsi="Arial" w:cs="Arial"/>
                 <w:color w:val="auto"/>
               </w:rPr>
-              <w:t xml:space="preserve">(1) assistir ao vídeo de apresentação da disciplina e à videoaula da unidade; (2) ler a leitura obrigatória; (3) estudar as Unidades 1 e 2 da página de conteúdos e os slides 1 a 10; (4) participar do Fórum de apresentação e do Fórum temático 1.</w:t>
+              <w:t xml:space="preserve">(1) assistir ao vídeo de apresentação da disciplina e à videoaula da unidade; (2) ler a leitura obrigatória; (3) estudar as Unidades 1 e 2 da página de conteúdos e os slides da Unidade 1; (4) participar do Fórum de apresentação e do Fórum temático 1.</w:t>
             </w:r>
           </w:p>
         </w:tc>
@@ -2232,7 +2232,7 @@
                 <w:rFonts w:ascii="Arial" w:hAnsi="Arial" w:cs="Arial"/>
                 <w:color w:val="auto"/>
               </w:rPr>
-              <w:t xml:space="preserve">(1) assistir à videoaula da unidade; (2) ler a leitura obrigatória; (3) estudar as Unidades 3 e 4 da página de conteúdos e os slides 11 a 15; (4) fazer os Exercícios de fixação 1; (5) responder à Avaliação A1 no SIGAA.</w:t>
+              <w:t xml:space="preserve">(1) assistir à videoaula da unidade; (2) ler a leitura obrigatória; (3) estudar as Unidades 3 e 4 da página de conteúdos e os slides da Unidade 2; (4) fazer os Exercícios de fixação 1; (5) responder à Avaliação A1 no SIGAA.</w:t>
             </w:r>
           </w:p>
         </w:tc>
@@ -2632,7 +2632,7 @@
                 <w:rFonts w:ascii="Arial" w:hAnsi="Arial" w:cs="Arial"/>
                 <w:color w:val="auto"/>
               </w:rPr>
-              <w:t xml:space="preserve">(1) assistir à videoaula da unidade; (2) ler a leitura obrigatória; (3) estudar as Unidades 5 e 6 da página de conteúdos e os slides 16 a 20; (4) participar do Fórum temático 2 e do encontro síncrono (28/10, 19h).</w:t>
+              <w:t xml:space="preserve">(1) assistir à videoaula da unidade; (2) ler a leitura obrigatória; (3) estudar as Unidades 5 e 6 da página de conteúdos e os slides da Unidade 3; (4) participar do Fórum temático 2 e do encontro síncrono (26/10, 19h).</w:t>
             </w:r>
           </w:p>
         </w:tc>
@@ -2907,7 +2907,7 @@
                 <w:rFonts w:ascii="Arial" w:hAnsi="Arial" w:cs="Arial"/>
                 <w:color w:val="auto"/>
               </w:rPr>
-              <w:t xml:space="preserve">Fórum temático 2 (até 01/11) e encontro síncrono (28/10, 19h).</w:t>
+              <w:t xml:space="preserve">Fórum temático 2 (até 01/11) e encontro síncrono (26/10, 19h).</w:t>
             </w:r>
           </w:p>
         </w:tc>
@@ -3031,7 +3031,7 @@
                 <w:rFonts w:ascii="Arial" w:hAnsi="Arial" w:cs="Arial"/>
                 <w:color w:val="auto"/>
               </w:rPr>
-              <w:t xml:space="preserve">(1) assistir à videoaula da unidade; (2) ler a leitura obrigatória; (3) estudar as Unidades 7 e 8 da página de conteúdos e os slides 21 a 28; (4) fazer os Exercícios de fixação 2 e rever a gravação do encontro síncrono; (5) responder às Avaliações A2 e A3 no SIGAA.</w:t>
+              <w:t xml:space="preserve">(1) assistir à videoaula da unidade; (2) ler a leitura obrigatória; (3) estudar as Unidades 7 e 8 da página de conteúdos e os slides da Unidade 4; (4) fazer os Exercícios de fixação 2 e rever a gravação do encontro síncrono; (5) responder às Avaliações A2 e A3 no SIGAA.</w:t>
             </w:r>
           </w:p>
         </w:tc>
@@ -3398,7 +3398,7 @@
                 <w:rFonts w:ascii="Arial" w:hAnsi="Arial" w:cs="Arial"/>
                 <w:color w:val="auto"/>
               </w:rPr>
-              <w:t xml:space="preserve">Gravação do encontro síncrono (28/10), com orientações para as Avaliações A2 e A3.</w:t>
+              <w:t xml:space="preserve">Gravação do encontro síncrono (26/10), com orientações para as Avaliações A2 e A3.</w:t>
             </w:r>
           </w:p>
         </w:tc>
@@ -3662,7 +3662,7 @@
             </w:pPr>
             <w:r>
               <w:rPr/>
-              <w:t xml:space="preserve">Leitura, videoaula e slides 1 a 10.</w:t>
+              <w:t xml:space="preserve">Leitura, videoaula e slides da Unidade 1.</w:t>
             </w:r>
           </w:p>
         </w:tc>
@@ -3866,7 +3866,7 @@
             </w:pPr>
             <w:r>
               <w:rPr/>
-              <w:t xml:space="preserve">Encontro síncrono: 28/10, 19h às 20h30.</w:t>
+              <w:t xml:space="preserve">Encontro síncrono: 26/10 (segunda-feira), 19h às 20h30.</w:t>
             </w:r>
           </w:p>
         </w:tc>
@@ -4342,7 +4342,7 @@
                 <w:rFonts w:ascii="Arial" w:hAnsi="Arial" w:cs="Arial"/>
                 <w:color w:val="auto"/>
               </w:rPr>
-              <w:t xml:space="preserve">Um encontro síncrono de 1h30 com professor e mediador pedagógico, em 28/10, às 19h (item 7), gravado e disponibilizado no SIGAA;</w:t>
+              <w:t xml:space="preserve">Um encontro síncrono de 1h30 com professor e mediador pedagógico, em 26/10 (segunda-feira), às 19h (item 7), gravado e disponibilizado no SIGAA;</w:t>
             </w:r>
           </w:p>
           <w:p>
@@ -5017,7 +5017,7 @@
           <w:rFonts w:ascii="Arial" w:hAnsi="Arial" w:cs="Arial"/>
           <w:color w:val="auto"/>
         </w:rPr>
-        <w:t xml:space="preserve">A disciplina prevê um único encontro síncrono (Google Meet), de 1h30, gravado e disponibilizado no SIGAA. O link é divulgado no SIGAA; data e horário a confirmar com a Coordenação.</w:t>
+        <w:t xml:space="preserve">A disciplina prevê um único encontro síncrono (Google Meet), de 1h30, gravado e disponibilizado no SIGAA. Data: segunda-feira, 26/10/2026, das 19h às 20h30. O link é divulgado no SIGAA.</w:t>
       </w:r>
     </w:p>
     <w:tbl>
@@ -5146,7 +5146,7 @@
             </w:pPr>
             <w:r>
               <w:rPr/>
-              <w:t xml:space="preserve">28/10/2026 (qua)</w:t>
+              <w:t xml:space="preserve">26/10/2026 (seg)</w:t>
             </w:r>
           </w:p>
           <w:p>
@@ -5184,7 +5184,7 @@
             </w:pPr>
             <w:r>
               <w:rPr/>
-              <w:t xml:space="preserve">Encontro síncrono (webaula)</w:t>
+              <w:t xml:space="preserve">Encontro síncrono (webaula única)</w:t>
             </w:r>
           </w:p>
         </w:tc>
@@ -5209,7 +5209,7 @@
             </w:pPr>
             <w:r>
               <w:rPr/>
-              <w:t xml:space="preserve">Revisão dos conceitos centrais das Unidades 1 a 3 (Estado, governo e mercado; falhas de mercado; matrizes liberal e marxista), esclarecimento de dúvidas e orientações para as Avaliações A2 e A3.</w:t>
+              <w:t xml:space="preserve">Revisão dos conceitos centrais das Unidades 1 e 2 (Estado, governo e mercado; falhas de mercado; matriz liberal), abertura da Unidade 3 (matriz marxista), esclarecimento de dúvidas e orientações para as Avaliações A2 e A3.</w:t>
             </w:r>
           </w:p>
         </w:tc>

</xml_diff>